<commit_message>
Update model selection note
</commit_message>
<xml_diff>
--- a/docs/requirements/MODEL SELECTION NOTE GROUP D.docx
+++ b/docs/requirements/MODEL SELECTION NOTE GROUP D.docx
@@ -7,7 +7,7 @@
         <w:spacing w:before="100" w:beforeAutospacing="1" w:after="0" w:line="240" w:lineRule="auto"/>
         <w:outlineLvl w:val="0"/>
         <w:rPr>
-          <w:rFonts w:ascii="Times New Roman" w:eastAsia="Times New Roman" w:hAnsi="Times New Roman" w:cs="Times New Roman"/>
+          <w:rFonts w:eastAsia="Times New Roman" w:cstheme="minorHAnsi"/>
           <w:b/>
           <w:bCs/>
           <w:color w:val="1F1F1F"/>
@@ -19,7 +19,7 @@
       </w:pPr>
       <w:r>
         <w:rPr>
-          <w:rFonts w:ascii="Times New Roman" w:eastAsia="Times New Roman" w:hAnsi="Times New Roman" w:cs="Times New Roman"/>
+          <w:rFonts w:eastAsia="Times New Roman" w:cstheme="minorHAnsi"/>
           <w:b/>
           <w:bCs/>
           <w:color w:val="1F1F1F"/>
@@ -35,7 +35,7 @@
       <w:pPr>
         <w:spacing w:after="0" w:line="240" w:lineRule="auto"/>
         <w:rPr>
-          <w:rFonts w:ascii="Times New Roman" w:eastAsia="Times New Roman" w:hAnsi="Times New Roman" w:cs="Times New Roman"/>
+          <w:rFonts w:eastAsia="Times New Roman" w:cstheme="minorHAnsi"/>
           <w:color w:val="1F1F1F"/>
           <w:sz w:val="20"/>
           <w:szCs w:val="20"/>
@@ -44,7 +44,7 @@
       </w:pPr>
       <w:r>
         <w:rPr>
-          <w:rFonts w:ascii="Times New Roman" w:eastAsia="Times New Roman" w:hAnsi="Times New Roman" w:cs="Times New Roman"/>
+          <w:rFonts w:eastAsia="Times New Roman" w:cstheme="minorHAnsi"/>
           <w:b/>
           <w:bCs/>
           <w:color w:val="1F1F1F"/>
@@ -57,7 +57,7 @@
       </w:r>
       <w:r>
         <w:rPr>
-          <w:rFonts w:ascii="Times New Roman" w:eastAsia="Times New Roman" w:hAnsi="Times New Roman" w:cs="Times New Roman"/>
+          <w:rFonts w:eastAsia="Times New Roman" w:cstheme="minorHAnsi"/>
           <w:color w:val="1F1F1F"/>
           <w:sz w:val="20"/>
           <w:szCs w:val="20"/>
@@ -70,7 +70,7 @@
       <w:pPr>
         <w:spacing w:after="0" w:line="240" w:lineRule="auto"/>
         <w:rPr>
-          <w:rFonts w:ascii="Times New Roman" w:eastAsia="Times New Roman" w:hAnsi="Times New Roman" w:cs="Times New Roman"/>
+          <w:rFonts w:eastAsia="Times New Roman" w:cstheme="minorHAnsi"/>
           <w:color w:val="1F1F1F"/>
           <w:sz w:val="20"/>
           <w:szCs w:val="20"/>
@@ -82,7 +82,7 @@
       <w:pPr>
         <w:spacing w:after="0" w:line="240" w:lineRule="auto"/>
         <w:rPr>
-          <w:rFonts w:ascii="Times New Roman" w:eastAsia="Times New Roman" w:hAnsi="Times New Roman" w:cs="Times New Roman"/>
+          <w:rFonts w:eastAsia="Times New Roman" w:cstheme="minorHAnsi"/>
           <w:color w:val="1F1F1F"/>
           <w:sz w:val="20"/>
           <w:szCs w:val="20"/>
@@ -91,7 +91,7 @@
       </w:pPr>
       <w:r>
         <w:rPr>
-          <w:rFonts w:ascii="Times New Roman" w:eastAsia="Times New Roman" w:hAnsi="Times New Roman" w:cs="Times New Roman"/>
+          <w:rFonts w:eastAsia="Times New Roman" w:cstheme="minorHAnsi"/>
           <w:b/>
           <w:bCs/>
           <w:color w:val="1F1F1F"/>
@@ -104,20 +104,32 @@
       </w:r>
       <w:r>
         <w:rPr>
-          <w:rFonts w:ascii="Times New Roman" w:eastAsia="Times New Roman" w:hAnsi="Times New Roman" w:cs="Times New Roman"/>
+          <w:rFonts w:eastAsia="Times New Roman" w:cstheme="minorHAnsi"/>
           <w:color w:val="1F1F1F"/>
           <w:sz w:val="20"/>
           <w:szCs w:val="20"/>
           <w:lang w:val="en-UG" w:eastAsia="en-UG"/>
         </w:rPr>
-        <w:t xml:space="preserve"> SME Procurement Preparation Agent (Group D)</w:t>
-      </w:r>
+        <w:t xml:space="preserve"> SME Procurement Preparation Agent </w:t>
+      </w:r>
+      <w:r>
+        <w:rPr>
+          <w:rFonts w:eastAsia="Times New Roman" w:cstheme="minorHAnsi"/>
+          <w:color w:val="1F1F1F"/>
+          <w:sz w:val="20"/>
+          <w:szCs w:val="20"/>
+          <w:lang w:val="en-US" w:eastAsia="en-UG"/>
+        </w:rPr>
+        <w:t>For CAC Supermarket</w:t>
+      </w:r>
+      <w:bookmarkStart w:id="0" w:name="_GoBack"/>
+      <w:bookmarkEnd w:id="0"/>
     </w:p>
     <w:p>
       <w:pPr>
         <w:spacing w:after="0" w:line="240" w:lineRule="auto"/>
         <w:rPr>
-          <w:rFonts w:ascii="Times New Roman" w:eastAsia="Times New Roman" w:hAnsi="Times New Roman" w:cs="Times New Roman"/>
+          <w:rFonts w:eastAsia="Times New Roman" w:cstheme="minorHAnsi"/>
           <w:color w:val="1F1F1F"/>
           <w:sz w:val="20"/>
           <w:szCs w:val="20"/>
@@ -129,7 +141,7 @@
       <w:pPr>
         <w:spacing w:after="0" w:line="240" w:lineRule="auto"/>
         <w:rPr>
-          <w:rFonts w:ascii="Times New Roman" w:eastAsia="Times New Roman" w:hAnsi="Times New Roman" w:cs="Times New Roman"/>
+          <w:rFonts w:eastAsia="Times New Roman" w:cstheme="minorHAnsi"/>
           <w:color w:val="1F1F1F"/>
           <w:sz w:val="20"/>
           <w:szCs w:val="20"/>
@@ -138,7 +150,7 @@
       </w:pPr>
       <w:r>
         <w:rPr>
-          <w:rFonts w:ascii="Times New Roman" w:eastAsia="Times New Roman" w:hAnsi="Times New Roman" w:cs="Times New Roman"/>
+          <w:rFonts w:eastAsia="Times New Roman" w:cstheme="minorHAnsi"/>
           <w:b/>
           <w:bCs/>
           <w:color w:val="1F1F1F"/>
@@ -151,7 +163,7 @@
       </w:r>
       <w:r>
         <w:rPr>
-          <w:rFonts w:ascii="Times New Roman" w:eastAsia="Times New Roman" w:hAnsi="Times New Roman" w:cs="Times New Roman"/>
+          <w:rFonts w:eastAsia="Times New Roman" w:cstheme="minorHAnsi"/>
           <w:color w:val="1F1F1F"/>
           <w:sz w:val="20"/>
           <w:szCs w:val="20"/>
@@ -164,7 +176,7 @@
       <w:pPr>
         <w:spacing w:after="0" w:line="240" w:lineRule="auto"/>
         <w:rPr>
-          <w:rFonts w:ascii="Times New Roman" w:eastAsia="Times New Roman" w:hAnsi="Times New Roman" w:cs="Times New Roman"/>
+          <w:rFonts w:eastAsia="Times New Roman" w:cstheme="minorHAnsi"/>
           <w:color w:val="1F1F1F"/>
           <w:sz w:val="20"/>
           <w:szCs w:val="20"/>
@@ -176,7 +188,7 @@
       <w:pPr>
         <w:spacing w:after="0" w:line="240" w:lineRule="auto"/>
         <w:rPr>
-          <w:rFonts w:ascii="Times New Roman" w:eastAsia="Times New Roman" w:hAnsi="Times New Roman" w:cs="Times New Roman"/>
+          <w:rFonts w:eastAsia="Times New Roman" w:cstheme="minorHAnsi"/>
           <w:color w:val="1F1F1F"/>
           <w:sz w:val="20"/>
           <w:szCs w:val="20"/>
@@ -185,7 +197,7 @@
       </w:pPr>
       <w:r>
         <w:rPr>
-          <w:rFonts w:ascii="Times New Roman" w:eastAsia="Times New Roman" w:hAnsi="Times New Roman" w:cs="Times New Roman"/>
+          <w:rFonts w:eastAsia="Times New Roman" w:cstheme="minorHAnsi"/>
           <w:b/>
           <w:bCs/>
           <w:color w:val="1F1F1F"/>
@@ -198,7 +210,7 @@
       </w:r>
       <w:r>
         <w:rPr>
-          <w:rFonts w:ascii="Times New Roman" w:eastAsia="Times New Roman" w:hAnsi="Times New Roman" w:cs="Times New Roman"/>
+          <w:rFonts w:eastAsia="Times New Roman" w:cstheme="minorHAnsi"/>
           <w:color w:val="1F1F1F"/>
           <w:sz w:val="20"/>
           <w:szCs w:val="20"/>
@@ -211,7 +223,7 @@
       <w:pPr>
         <w:spacing w:after="0" w:line="240" w:lineRule="auto"/>
         <w:rPr>
-          <w:rFonts w:ascii="Times New Roman" w:eastAsia="Times New Roman" w:hAnsi="Times New Roman" w:cs="Times New Roman"/>
+          <w:rFonts w:eastAsia="Times New Roman" w:cstheme="minorHAnsi"/>
           <w:color w:val="1F1F1F"/>
           <w:sz w:val="20"/>
           <w:szCs w:val="20"/>
@@ -223,7 +235,7 @@
       <w:pPr>
         <w:spacing w:after="0" w:line="240" w:lineRule="auto"/>
         <w:rPr>
-          <w:rFonts w:ascii="Times New Roman" w:eastAsia="Times New Roman" w:hAnsi="Times New Roman" w:cs="Times New Roman"/>
+          <w:rFonts w:eastAsia="Times New Roman" w:cstheme="minorHAnsi"/>
           <w:b/>
           <w:color w:val="1F1F1F"/>
           <w:sz w:val="20"/>
@@ -233,114 +245,93 @@
       </w:pPr>
       <w:r>
         <w:rPr>
-          <w:rFonts w:ascii="Times New Roman" w:eastAsia="Times New Roman" w:hAnsi="Times New Roman" w:cs="Times New Roman"/>
+          <w:rFonts w:eastAsia="Times New Roman" w:cstheme="minorHAnsi"/>
           <w:b/>
           <w:color w:val="1F1F1F"/>
           <w:sz w:val="20"/>
           <w:szCs w:val="20"/>
           <w:lang w:val="en-US" w:eastAsia="en-UG"/>
         </w:rPr>
-        <w:t xml:space="preserve">Designed by: RUGAMBWA </w:t>
-      </w:r>
-      <w:proofErr w:type="gramStart"/>
-      <w:r>
-        <w:rPr>
-          <w:rFonts w:ascii="Times New Roman" w:eastAsia="Times New Roman" w:hAnsi="Times New Roman" w:cs="Times New Roman"/>
+        <w:t>Designed by: RUGAMBWA GLORIA</w:t>
+      </w:r>
+      <w:r>
+        <w:rPr>
+          <w:rFonts w:eastAsia="Times New Roman" w:cstheme="minorHAnsi"/>
           <w:b/>
           <w:color w:val="1F1F1F"/>
           <w:sz w:val="20"/>
           <w:szCs w:val="20"/>
           <w:lang w:val="en-US" w:eastAsia="en-UG"/>
         </w:rPr>
-        <w:t>GLORIA</w:t>
-      </w:r>
-      <w:r>
-        <w:rPr>
-          <w:rFonts w:ascii="Times New Roman" w:eastAsia="Times New Roman" w:hAnsi="Times New Roman" w:cs="Times New Roman"/>
+        <w:t xml:space="preserve"> </w:t>
+      </w:r>
+      <w:r>
+        <w:rPr>
+          <w:rFonts w:eastAsia="Times New Roman" w:cstheme="minorHAnsi"/>
           <w:b/>
           <w:color w:val="1F1F1F"/>
           <w:sz w:val="20"/>
           <w:szCs w:val="20"/>
           <w:lang w:val="en-US" w:eastAsia="en-UG"/>
         </w:rPr>
-        <w:t>(</w:t>
-      </w:r>
-      <w:bookmarkStart w:id="0" w:name="_GoBack"/>
-      <w:bookmarkEnd w:id="0"/>
-      <w:proofErr w:type="gramEnd"/>
-      <w:r>
-        <w:rPr>
-          <w:rFonts w:ascii="Times New Roman" w:eastAsia="Times New Roman" w:hAnsi="Times New Roman" w:cs="Times New Roman"/>
+        <w:t>(Project/Requirements Lead)</w:t>
+      </w:r>
+    </w:p>
+    <w:p>
+      <w:pPr>
+        <w:spacing w:after="0" w:line="240" w:lineRule="auto"/>
+        <w:rPr>
+          <w:rFonts w:eastAsia="Times New Roman" w:cstheme="minorHAnsi"/>
           <w:b/>
           <w:color w:val="1F1F1F"/>
           <w:sz w:val="20"/>
           <w:szCs w:val="20"/>
           <w:lang w:val="en-US" w:eastAsia="en-UG"/>
         </w:rPr>
-        <w:t>Project/Requirements Lead</w:t>
-      </w:r>
-      <w:r>
-        <w:rPr>
-          <w:rFonts w:ascii="Times New Roman" w:eastAsia="Times New Roman" w:hAnsi="Times New Roman" w:cs="Times New Roman"/>
-          <w:b/>
-          <w:color w:val="1F1F1F"/>
-          <w:sz w:val="20"/>
-          <w:szCs w:val="20"/>
-          <w:lang w:val="en-US" w:eastAsia="en-UG"/>
-        </w:rPr>
-        <w:t>)</w:t>
-      </w:r>
+      </w:pPr>
     </w:p>
     <w:p>
       <w:pPr>
         <w:spacing w:after="0" w:line="240" w:lineRule="auto"/>
         <w:rPr>
-          <w:rFonts w:ascii="Times New Roman" w:eastAsia="Times New Roman" w:hAnsi="Times New Roman" w:cs="Times New Roman"/>
+          <w:rFonts w:cstheme="minorHAnsi"/>
           <w:b/>
-          <w:color w:val="1F1F1F"/>
-          <w:sz w:val="20"/>
-          <w:szCs w:val="20"/>
-          <w:lang w:val="en-US" w:eastAsia="en-UG"/>
-        </w:rPr>
-      </w:pPr>
-    </w:p>
-    <w:p>
-      <w:pPr>
-        <w:spacing w:after="0" w:line="240" w:lineRule="auto"/>
-        <w:rPr>
+          <w:sz w:val="20"/>
+          <w:szCs w:val="20"/>
+          <w:lang w:val="en-US"/>
+        </w:rPr>
+      </w:pPr>
+      <w:r>
+        <w:rPr>
+          <w:rFonts w:cstheme="minorHAnsi"/>
           <w:b/>
           <w:sz w:val="20"/>
           <w:szCs w:val="20"/>
-          <w:lang w:val="en-US"/>
-        </w:rPr>
-      </w:pPr>
-      <w:r>
-        <w:rPr>
+        </w:rPr>
+        <w:t xml:space="preserve">Capability </w:t>
+      </w:r>
+      <w:r>
+        <w:rPr>
+          <w:rFonts w:cstheme="minorHAnsi"/>
           <w:b/>
           <w:sz w:val="20"/>
           <w:szCs w:val="20"/>
-        </w:rPr>
-        <w:t xml:space="preserve">Capability </w:t>
-      </w:r>
-      <w:r>
-        <w:rPr>
+          <w:lang w:val="en-US"/>
+        </w:rPr>
+        <w:t>and</w:t>
+      </w:r>
+      <w:r>
+        <w:rPr>
+          <w:rFonts w:cstheme="minorHAnsi"/>
           <w:b/>
           <w:sz w:val="20"/>
           <w:szCs w:val="20"/>
-          <w:lang w:val="en-US"/>
-        </w:rPr>
-        <w:t>and</w:t>
-      </w:r>
-      <w:r>
-        <w:rPr>
-          <w:b/>
-          <w:sz w:val="20"/>
-          <w:szCs w:val="20"/>
         </w:rPr>
         <w:t xml:space="preserve"> Architecture </w:t>
       </w:r>
       <w:r>
         <w:rPr>
+          <w:rFonts w:cstheme="minorHAnsi"/>
           <w:b/>
           <w:sz w:val="20"/>
           <w:szCs w:val="20"/>
@@ -357,13 +348,15 @@
         </w:numPr>
         <w:spacing w:after="0" w:line="240" w:lineRule="auto"/>
         <w:rPr>
-          <w:sz w:val="20"/>
-          <w:szCs w:val="20"/>
-          <w:lang w:val="en-US"/>
-        </w:rPr>
-      </w:pPr>
-      <w:r>
-        <w:rPr>
+          <w:rFonts w:cstheme="minorHAnsi"/>
+          <w:sz w:val="20"/>
+          <w:szCs w:val="20"/>
+          <w:lang w:val="en-US"/>
+        </w:rPr>
+      </w:pPr>
+      <w:r>
+        <w:rPr>
+          <w:rFonts w:cstheme="minorHAnsi"/>
           <w:sz w:val="20"/>
           <w:szCs w:val="20"/>
           <w:lang w:val="en-US"/>
@@ -372,6 +365,7 @@
       </w:r>
       <w:r>
         <w:rPr>
+          <w:rFonts w:cstheme="minorHAnsi"/>
           <w:sz w:val="20"/>
           <w:szCs w:val="20"/>
           <w:lang w:val="en-US"/>
@@ -380,6 +374,7 @@
       </w:r>
       <w:r>
         <w:rPr>
+          <w:rFonts w:cstheme="minorHAnsi"/>
           <w:sz w:val="20"/>
           <w:szCs w:val="20"/>
           <w:lang w:val="en-US"/>
@@ -389,6 +384,7 @@
       <w:proofErr w:type="gramStart"/>
       <w:r>
         <w:rPr>
+          <w:rFonts w:cstheme="minorHAnsi"/>
           <w:sz w:val="20"/>
           <w:szCs w:val="20"/>
           <w:lang w:val="en-US"/>
@@ -398,6 +394,7 @@
       <w:proofErr w:type="gramEnd"/>
       <w:r>
         <w:rPr>
+          <w:rFonts w:cstheme="minorHAnsi"/>
           <w:sz w:val="20"/>
           <w:szCs w:val="20"/>
           <w:lang w:val="en-US"/>
@@ -414,13 +411,15 @@
         </w:numPr>
         <w:spacing w:after="0" w:line="240" w:lineRule="auto"/>
         <w:rPr>
-          <w:sz w:val="20"/>
-          <w:szCs w:val="20"/>
-          <w:lang w:val="en-US"/>
-        </w:rPr>
-      </w:pPr>
-      <w:r>
-        <w:rPr>
+          <w:rFonts w:cstheme="minorHAnsi"/>
+          <w:sz w:val="20"/>
+          <w:szCs w:val="20"/>
+          <w:lang w:val="en-US"/>
+        </w:rPr>
+      </w:pPr>
+      <w:r>
+        <w:rPr>
+          <w:rFonts w:cstheme="minorHAnsi"/>
           <w:sz w:val="20"/>
           <w:szCs w:val="20"/>
           <w:lang w:val="en-US"/>
@@ -429,6 +428,7 @@
       </w:r>
       <w:r>
         <w:rPr>
+          <w:rFonts w:cstheme="minorHAnsi"/>
           <w:sz w:val="20"/>
           <w:szCs w:val="20"/>
           <w:lang w:val="en-US"/>
@@ -437,6 +437,7 @@
       </w:r>
       <w:r>
         <w:rPr>
+          <w:rFonts w:cstheme="minorHAnsi"/>
           <w:sz w:val="20"/>
           <w:szCs w:val="20"/>
           <w:lang w:val="en-US"/>
@@ -453,13 +454,15 @@
         </w:numPr>
         <w:spacing w:after="0" w:line="240" w:lineRule="auto"/>
         <w:rPr>
-          <w:sz w:val="20"/>
-          <w:szCs w:val="20"/>
-          <w:lang w:val="en-US"/>
-        </w:rPr>
-      </w:pPr>
-      <w:r>
-        <w:rPr>
+          <w:rFonts w:cstheme="minorHAnsi"/>
+          <w:sz w:val="20"/>
+          <w:szCs w:val="20"/>
+          <w:lang w:val="en-US"/>
+        </w:rPr>
+      </w:pPr>
+      <w:r>
+        <w:rPr>
+          <w:rFonts w:cstheme="minorHAnsi"/>
           <w:sz w:val="20"/>
           <w:szCs w:val="20"/>
           <w:lang w:val="en-US"/>
@@ -468,6 +471,7 @@
       </w:r>
       <w:r>
         <w:rPr>
+          <w:rFonts w:cstheme="minorHAnsi"/>
           <w:sz w:val="20"/>
           <w:szCs w:val="20"/>
           <w:lang w:val="en-US"/>
@@ -476,6 +480,7 @@
       </w:r>
       <w:r>
         <w:rPr>
+          <w:rFonts w:cstheme="minorHAnsi"/>
           <w:sz w:val="20"/>
           <w:szCs w:val="20"/>
           <w:lang w:val="en-US"/>
@@ -488,6 +493,7 @@
         <w:pStyle w:val="ListParagraph"/>
         <w:spacing w:after="0" w:line="240" w:lineRule="auto"/>
         <w:rPr>
+          <w:rFonts w:cstheme="minorHAnsi"/>
           <w:sz w:val="20"/>
           <w:szCs w:val="20"/>
           <w:lang w:val="en-US"/>
@@ -498,6 +504,7 @@
       <w:pPr>
         <w:spacing w:after="0" w:line="240" w:lineRule="auto"/>
         <w:rPr>
+          <w:rFonts w:cstheme="minorHAnsi"/>
           <w:b/>
           <w:sz w:val="20"/>
           <w:szCs w:val="20"/>
@@ -506,6 +513,7 @@
       </w:pPr>
       <w:r>
         <w:rPr>
+          <w:rFonts w:cstheme="minorHAnsi"/>
           <w:sz w:val="20"/>
           <w:szCs w:val="20"/>
           <w:lang w:val="en-US"/>
@@ -514,6 +522,7 @@
       </w:r>
       <w:r>
         <w:rPr>
+          <w:rFonts w:cstheme="minorHAnsi"/>
           <w:b/>
           <w:sz w:val="20"/>
           <w:szCs w:val="20"/>
@@ -526,20 +535,23 @@
       <w:pPr>
         <w:spacing w:after="0" w:line="240" w:lineRule="auto"/>
         <w:rPr>
-          <w:sz w:val="20"/>
-          <w:szCs w:val="20"/>
-        </w:rPr>
-      </w:pPr>
-      <w:r>
-        <w:rPr>
-          <w:sz w:val="20"/>
-          <w:szCs w:val="20"/>
-          <w:lang w:val="en-US"/>
-        </w:rPr>
-        <w:t xml:space="preserve"> It is </w:t>
-      </w:r>
-      <w:r>
-        <w:rPr>
+          <w:rFonts w:cstheme="minorHAnsi"/>
+          <w:sz w:val="20"/>
+          <w:szCs w:val="20"/>
+        </w:rPr>
+      </w:pPr>
+      <w:r>
+        <w:rPr>
+          <w:rFonts w:cstheme="minorHAnsi"/>
+          <w:sz w:val="20"/>
+          <w:szCs w:val="20"/>
+          <w:lang w:val="en-US"/>
+        </w:rPr>
+        <w:t xml:space="preserve">It is </w:t>
+      </w:r>
+      <w:r>
+        <w:rPr>
+          <w:rFonts w:cstheme="minorHAnsi"/>
           <w:sz w:val="20"/>
           <w:szCs w:val="20"/>
         </w:rPr>
@@ -547,6 +559,7 @@
       </w:r>
       <w:r>
         <w:rPr>
+          <w:rFonts w:cstheme="minorHAnsi"/>
           <w:sz w:val="20"/>
           <w:szCs w:val="20"/>
         </w:rPr>
@@ -557,6 +570,7 @@
       <w:pPr>
         <w:spacing w:after="0" w:line="240" w:lineRule="auto"/>
         <w:rPr>
+          <w:rFonts w:cstheme="minorHAnsi"/>
           <w:sz w:val="20"/>
           <w:szCs w:val="20"/>
         </w:rPr>
@@ -566,6 +580,7 @@
       <w:pPr>
         <w:spacing w:after="0" w:line="240" w:lineRule="auto"/>
         <w:rPr>
+          <w:rFonts w:cstheme="minorHAnsi"/>
           <w:b/>
           <w:sz w:val="20"/>
           <w:szCs w:val="20"/>
@@ -573,6 +588,7 @@
       </w:pPr>
       <w:r>
         <w:rPr>
+          <w:rFonts w:cstheme="minorHAnsi"/>
           <w:sz w:val="20"/>
           <w:szCs w:val="20"/>
         </w:rPr>
@@ -580,6 +596,7 @@
       </w:r>
       <w:r>
         <w:rPr>
+          <w:rFonts w:cstheme="minorHAnsi"/>
           <w:b/>
           <w:sz w:val="20"/>
           <w:szCs w:val="20"/>
@@ -588,6 +605,7 @@
       </w:r>
       <w:r>
         <w:rPr>
+          <w:rFonts w:cstheme="minorHAnsi"/>
           <w:b/>
           <w:sz w:val="20"/>
           <w:szCs w:val="20"/>
@@ -597,6 +615,7 @@
       </w:r>
       <w:r>
         <w:rPr>
+          <w:rFonts w:cstheme="minorHAnsi"/>
           <w:b/>
           <w:sz w:val="20"/>
           <w:szCs w:val="20"/>
@@ -613,13 +632,15 @@
         </w:numPr>
         <w:spacing w:after="0" w:line="240" w:lineRule="auto"/>
         <w:rPr>
-          <w:sz w:val="20"/>
-          <w:szCs w:val="20"/>
-          <w:lang w:val="en-US"/>
-        </w:rPr>
-      </w:pPr>
-      <w:r>
-        <w:rPr>
+          <w:rFonts w:cstheme="minorHAnsi"/>
+          <w:sz w:val="20"/>
+          <w:szCs w:val="20"/>
+          <w:lang w:val="en-US"/>
+        </w:rPr>
+      </w:pPr>
+      <w:r>
+        <w:rPr>
+          <w:rFonts w:cstheme="minorHAnsi"/>
           <w:sz w:val="20"/>
           <w:szCs w:val="20"/>
           <w:lang w:val="en-US"/>
@@ -635,13 +656,15 @@
           <w:numId w:val="8"/>
         </w:numPr>
         <w:rPr>
-          <w:sz w:val="20"/>
-          <w:szCs w:val="20"/>
-          <w:lang w:val="en-US"/>
-        </w:rPr>
-      </w:pPr>
-      <w:r>
-        <w:rPr>
+          <w:rFonts w:cstheme="minorHAnsi"/>
+          <w:sz w:val="20"/>
+          <w:szCs w:val="20"/>
+          <w:lang w:val="en-US"/>
+        </w:rPr>
+      </w:pPr>
+      <w:r>
+        <w:rPr>
+          <w:rFonts w:cstheme="minorHAnsi"/>
           <w:sz w:val="20"/>
           <w:szCs w:val="20"/>
           <w:lang w:val="en-US"/>
@@ -650,7 +673,7 @@
       </w:r>
       <w:r>
         <w:rPr>
-          <w:rFonts w:ascii="Times New Roman" w:eastAsia="Times New Roman" w:hAnsi="Times New Roman" w:cs="Times New Roman"/>
+          <w:rFonts w:eastAsia="Times New Roman" w:cstheme="minorHAnsi"/>
           <w:bCs/>
           <w:sz w:val="20"/>
           <w:szCs w:val="20"/>
@@ -660,7 +683,7 @@
       </w:r>
       <w:r>
         <w:rPr>
-          <w:rFonts w:ascii="Times New Roman" w:eastAsia="Times New Roman" w:hAnsi="Times New Roman" w:cs="Times New Roman"/>
+          <w:rFonts w:eastAsia="Times New Roman" w:cstheme="minorHAnsi"/>
           <w:bCs/>
           <w:sz w:val="20"/>
           <w:szCs w:val="20"/>
@@ -670,7 +693,7 @@
       </w:r>
       <w:r>
         <w:rPr>
-          <w:rFonts w:ascii="Times New Roman" w:eastAsia="Times New Roman" w:hAnsi="Times New Roman" w:cs="Times New Roman"/>
+          <w:rFonts w:eastAsia="Times New Roman" w:cstheme="minorHAnsi"/>
           <w:bCs/>
           <w:sz w:val="20"/>
           <w:szCs w:val="20"/>
@@ -680,7 +703,7 @@
       </w:r>
       <w:r>
         <w:rPr>
-          <w:rFonts w:ascii="Times New Roman" w:eastAsia="Times New Roman" w:hAnsi="Times New Roman" w:cs="Times New Roman"/>
+          <w:rFonts w:eastAsia="Times New Roman" w:cstheme="minorHAnsi"/>
           <w:sz w:val="20"/>
           <w:szCs w:val="20"/>
           <w:lang w:val="en-UG" w:eastAsia="en-UG"/>
@@ -689,7 +712,7 @@
       </w:r>
       <w:r>
         <w:rPr>
-          <w:rFonts w:ascii="Times New Roman" w:eastAsia="Times New Roman" w:hAnsi="Times New Roman" w:cs="Times New Roman"/>
+          <w:rFonts w:eastAsia="Times New Roman" w:cstheme="minorHAnsi"/>
           <w:sz w:val="20"/>
           <w:szCs w:val="20"/>
           <w:lang w:val="en-US" w:eastAsia="en-UG"/>
@@ -700,6 +723,7 @@
     <w:p>
       <w:pPr>
         <w:rPr>
+          <w:rFonts w:cstheme="minorHAnsi"/>
           <w:b/>
           <w:sz w:val="20"/>
           <w:szCs w:val="20"/>
@@ -707,6 +731,7 @@
       </w:pPr>
       <w:r>
         <w:rPr>
+          <w:rFonts w:cstheme="minorHAnsi"/>
           <w:sz w:val="20"/>
           <w:szCs w:val="20"/>
           <w:lang w:val="en-US"/>
@@ -715,6 +740,7 @@
       </w:r>
       <w:r>
         <w:rPr>
+          <w:rFonts w:cstheme="minorHAnsi"/>
           <w:b/>
           <w:sz w:val="20"/>
           <w:szCs w:val="20"/>
@@ -723,6 +749,7 @@
       </w:r>
       <w:r>
         <w:rPr>
+          <w:rFonts w:cstheme="minorHAnsi"/>
           <w:b/>
           <w:sz w:val="20"/>
           <w:szCs w:val="20"/>
@@ -732,6 +759,7 @@
       </w:r>
       <w:r>
         <w:rPr>
+          <w:rFonts w:cstheme="minorHAnsi"/>
           <w:b/>
           <w:sz w:val="20"/>
           <w:szCs w:val="20"/>
@@ -747,13 +775,15 @@
           <w:numId w:val="10"/>
         </w:numPr>
         <w:rPr>
-          <w:sz w:val="20"/>
-          <w:szCs w:val="20"/>
-          <w:lang w:val="en-US"/>
-        </w:rPr>
-      </w:pPr>
-      <w:r>
-        <w:rPr>
+          <w:rFonts w:cstheme="minorHAnsi"/>
+          <w:sz w:val="20"/>
+          <w:szCs w:val="20"/>
+          <w:lang w:val="en-US"/>
+        </w:rPr>
+      </w:pPr>
+      <w:r>
+        <w:rPr>
+          <w:rFonts w:cstheme="minorHAnsi"/>
           <w:sz w:val="20"/>
           <w:szCs w:val="20"/>
           <w:lang w:val="en-US"/>
@@ -769,13 +799,15 @@
           <w:numId w:val="10"/>
         </w:numPr>
         <w:rPr>
-          <w:sz w:val="20"/>
-          <w:szCs w:val="20"/>
-          <w:lang w:val="en-US"/>
-        </w:rPr>
-      </w:pPr>
-      <w:r>
-        <w:rPr>
+          <w:rFonts w:cstheme="minorHAnsi"/>
+          <w:sz w:val="20"/>
+          <w:szCs w:val="20"/>
+          <w:lang w:val="en-US"/>
+        </w:rPr>
+      </w:pPr>
+      <w:r>
+        <w:rPr>
+          <w:rFonts w:cstheme="minorHAnsi"/>
           <w:sz w:val="20"/>
           <w:szCs w:val="20"/>
           <w:lang w:val="en-US"/>
@@ -785,6 +817,7 @@
       <w:proofErr w:type="gramStart"/>
       <w:r>
         <w:rPr>
+          <w:rFonts w:cstheme="minorHAnsi"/>
           <w:sz w:val="20"/>
           <w:szCs w:val="20"/>
           <w:lang w:val="en-US"/>
@@ -794,6 +827,7 @@
       <w:proofErr w:type="gramEnd"/>
       <w:r>
         <w:rPr>
+          <w:rFonts w:cstheme="minorHAnsi"/>
           <w:sz w:val="20"/>
           <w:szCs w:val="20"/>
           <w:lang w:val="en-US"/>
@@ -804,6 +838,7 @@
     <w:p>
       <w:pPr>
         <w:rPr>
+          <w:rFonts w:cstheme="minorHAnsi"/>
           <w:b/>
           <w:sz w:val="20"/>
           <w:szCs w:val="20"/>
@@ -811,6 +846,7 @@
       </w:pPr>
       <w:r>
         <w:rPr>
+          <w:rFonts w:cstheme="minorHAnsi"/>
           <w:sz w:val="20"/>
           <w:szCs w:val="20"/>
           <w:lang w:val="en-US"/>
@@ -819,6 +855,7 @@
       </w:r>
       <w:r>
         <w:rPr>
+          <w:rFonts w:cstheme="minorHAnsi"/>
           <w:b/>
           <w:sz w:val="20"/>
           <w:szCs w:val="20"/>
@@ -827,6 +864,7 @@
       </w:r>
       <w:r>
         <w:rPr>
+          <w:rFonts w:cstheme="minorHAnsi"/>
           <w:b/>
           <w:sz w:val="20"/>
           <w:szCs w:val="20"/>
@@ -836,6 +874,7 @@
       </w:r>
       <w:r>
         <w:rPr>
+          <w:rFonts w:cstheme="minorHAnsi"/>
           <w:b/>
           <w:sz w:val="20"/>
           <w:szCs w:val="20"/>
@@ -851,13 +890,15 @@
           <w:numId w:val="9"/>
         </w:numPr>
         <w:rPr>
-          <w:sz w:val="20"/>
-          <w:szCs w:val="20"/>
-          <w:lang w:val="en-US"/>
-        </w:rPr>
-      </w:pPr>
-      <w:r>
-        <w:rPr>
+          <w:rFonts w:cstheme="minorHAnsi"/>
+          <w:sz w:val="20"/>
+          <w:szCs w:val="20"/>
+          <w:lang w:val="en-US"/>
+        </w:rPr>
+      </w:pPr>
+      <w:r>
+        <w:rPr>
+          <w:rFonts w:cstheme="minorHAnsi"/>
           <w:sz w:val="20"/>
           <w:szCs w:val="20"/>
           <w:lang w:val="en-US"/>
@@ -866,6 +907,7 @@
       </w:r>
       <w:r>
         <w:rPr>
+          <w:rFonts w:cstheme="minorHAnsi"/>
           <w:sz w:val="20"/>
           <w:szCs w:val="20"/>
           <w:lang w:val="en-US"/>
@@ -874,6 +916,7 @@
       </w:r>
       <w:r>
         <w:rPr>
+          <w:rFonts w:cstheme="minorHAnsi"/>
           <w:sz w:val="20"/>
           <w:szCs w:val="20"/>
           <w:lang w:val="en-US"/>
@@ -883,6 +926,7 @@
       <w:proofErr w:type="gramStart"/>
       <w:r>
         <w:rPr>
+          <w:rFonts w:cstheme="minorHAnsi"/>
           <w:sz w:val="20"/>
           <w:szCs w:val="20"/>
           <w:lang w:val="en-US"/>
@@ -892,6 +936,7 @@
       <w:proofErr w:type="spellStart"/>
       <w:r>
         <w:rPr>
+          <w:rFonts w:cstheme="minorHAnsi"/>
           <w:sz w:val="20"/>
           <w:szCs w:val="20"/>
           <w:lang w:val="en-US"/>
@@ -901,6 +946,7 @@
       <w:proofErr w:type="gramEnd"/>
       <w:r>
         <w:rPr>
+          <w:rFonts w:cstheme="minorHAnsi"/>
           <w:sz w:val="20"/>
           <w:szCs w:val="20"/>
           <w:lang w:val="en-US"/>
@@ -910,6 +956,7 @@
       <w:proofErr w:type="spellEnd"/>
       <w:r>
         <w:rPr>
+          <w:rFonts w:cstheme="minorHAnsi"/>
           <w:sz w:val="20"/>
           <w:szCs w:val="20"/>
           <w:lang w:val="en-US"/>
@@ -925,13 +972,15 @@
           <w:numId w:val="9"/>
         </w:numPr>
         <w:rPr>
-          <w:sz w:val="20"/>
-          <w:szCs w:val="20"/>
-          <w:lang w:val="en-US"/>
-        </w:rPr>
-      </w:pPr>
-      <w:r>
-        <w:rPr>
+          <w:rFonts w:cstheme="minorHAnsi"/>
+          <w:sz w:val="20"/>
+          <w:szCs w:val="20"/>
+          <w:lang w:val="en-US"/>
+        </w:rPr>
+      </w:pPr>
+      <w:r>
+        <w:rPr>
+          <w:rFonts w:cstheme="minorHAnsi"/>
           <w:sz w:val="20"/>
           <w:szCs w:val="20"/>
           <w:lang w:val="en-US"/>
@@ -941,6 +990,7 @@
       <w:proofErr w:type="spellStart"/>
       <w:r>
         <w:rPr>
+          <w:rFonts w:cstheme="minorHAnsi"/>
           <w:sz w:val="20"/>
           <w:szCs w:val="20"/>
           <w:lang w:val="en-US"/>
@@ -950,6 +1000,7 @@
       <w:proofErr w:type="spellEnd"/>
       <w:r>
         <w:rPr>
+          <w:rFonts w:cstheme="minorHAnsi"/>
           <w:sz w:val="20"/>
           <w:szCs w:val="20"/>
           <w:lang w:val="en-US"/>
@@ -959,6 +1010,7 @@
       <w:proofErr w:type="spellStart"/>
       <w:r>
         <w:rPr>
+          <w:rFonts w:cstheme="minorHAnsi"/>
           <w:sz w:val="20"/>
           <w:szCs w:val="20"/>
           <w:lang w:val="en-US"/>
@@ -968,6 +1020,7 @@
       <w:proofErr w:type="gramStart"/>
       <w:r>
         <w:rPr>
+          <w:rFonts w:cstheme="minorHAnsi"/>
           <w:sz w:val="20"/>
           <w:szCs w:val="20"/>
           <w:lang w:val="en-US"/>
@@ -977,6 +1030,7 @@
       <w:proofErr w:type="gramEnd"/>
       <w:r>
         <w:rPr>
+          <w:rFonts w:cstheme="minorHAnsi"/>
           <w:sz w:val="20"/>
           <w:szCs w:val="20"/>
           <w:lang w:val="en-US"/>
@@ -986,25 +1040,19 @@
       <w:proofErr w:type="spellEnd"/>
       <w:r>
         <w:rPr>
-          <w:sz w:val="20"/>
-          <w:szCs w:val="20"/>
-          <w:lang w:val="en-US"/>
-        </w:rPr>
-        <w:t xml:space="preserve"> API</w:t>
-      </w:r>
-      <w:r>
-        <w:rPr>
-          <w:sz w:val="20"/>
-          <w:szCs w:val="20"/>
-          <w:lang w:val="en-US"/>
-        </w:rPr>
-        <w:t>) without third-party wrapper dependencies.</w:t>
+          <w:rFonts w:cstheme="minorHAnsi"/>
+          <w:sz w:val="20"/>
+          <w:szCs w:val="20"/>
+          <w:lang w:val="en-US"/>
+        </w:rPr>
+        <w:t xml:space="preserve"> API) without third-party wrapper dependencies.</w:t>
       </w:r>
     </w:p>
     <w:p>
       <w:pPr>
         <w:pStyle w:val="ListParagraph"/>
         <w:rPr>
+          <w:rFonts w:cstheme="minorHAnsi"/>
           <w:sz w:val="20"/>
           <w:szCs w:val="20"/>
           <w:lang w:val="en-US"/>
@@ -1014,13 +1062,15 @@
     <w:p>
       <w:pPr>
         <w:rPr>
-          <w:sz w:val="20"/>
-          <w:szCs w:val="20"/>
-          <w:lang w:val="en-US"/>
-        </w:rPr>
-      </w:pPr>
-      <w:r>
-        <w:rPr>
+          <w:rFonts w:cstheme="minorHAnsi"/>
+          <w:sz w:val="20"/>
+          <w:szCs w:val="20"/>
+          <w:lang w:val="en-US"/>
+        </w:rPr>
+      </w:pPr>
+      <w:r>
+        <w:rPr>
+          <w:rFonts w:cstheme="minorHAnsi"/>
           <w:sz w:val="20"/>
           <w:szCs w:val="20"/>
           <w:lang w:val="en-US"/>
@@ -1033,7 +1083,7 @@
         <w:pStyle w:val="ListParagraph"/>
         <w:spacing w:after="0" w:line="240" w:lineRule="auto"/>
         <w:rPr>
-          <w:rFonts w:ascii="Times New Roman" w:eastAsia="Times New Roman" w:hAnsi="Times New Roman" w:cs="Times New Roman"/>
+          <w:rFonts w:eastAsia="Times New Roman" w:cstheme="minorHAnsi"/>
           <w:b/>
           <w:color w:val="1F1F1F"/>
           <w:sz w:val="20"/>
@@ -1046,7 +1096,7 @@
       <w:pPr>
         <w:spacing w:after="0" w:line="240" w:lineRule="auto"/>
         <w:rPr>
-          <w:rFonts w:ascii="Times New Roman" w:eastAsia="Times New Roman" w:hAnsi="Times New Roman" w:cs="Times New Roman"/>
+          <w:rFonts w:eastAsia="Times New Roman" w:cstheme="minorHAnsi"/>
           <w:color w:val="1F1F1F"/>
           <w:sz w:val="20"/>
           <w:szCs w:val="20"/>
@@ -1055,7 +1105,7 @@
       </w:pPr>
       <w:r>
         <w:rPr>
-          <w:rFonts w:ascii="Times New Roman" w:eastAsia="Times New Roman" w:hAnsi="Times New Roman" w:cs="Times New Roman"/>
+          <w:rFonts w:eastAsia="Times New Roman" w:cstheme="minorHAnsi"/>
           <w:color w:val="1F1F1F"/>
           <w:sz w:val="20"/>
           <w:szCs w:val="20"/>

</xml_diff>